<commit_message>
feat: paragraphs keep their alignment and indents
The native PDF engine sets paragraphs and headings centred, right-aligned
or justified, and indented (left, right, first line, hanging); they all
printed left-aligned from the margin. Word's justified paragraphs
(w:jc both, distribute) are read as justified, and start and end as left
and right. ODT's indents and RTF's \li \ri \fi are read, RTF's plain
paragraphs and headings keep their alignment, and RTF output writes them.
Markdown output wraps no empty heading in an alignment div.
</commit_message>
<xml_diff>
--- a/test/generator/baseline/gen.odp.to.docx.docx
+++ b/test/generator/baseline/gen.odp.to.docx.docx
@@ -2193,6 +2193,9 @@
       </w:r>
     </w:p>
     <w:p>
+      <w:pPr>
+        <w:ind w:left="360" w:hanging="360"/>
+      </w:pPr>
       <w:r>
         <w:rPr>
           <w:rFonts w:ascii="Ubuntu" w:hAnsi="Ubuntu"/>
@@ -5142,6 +5145,9 @@
       <w:bookmarkEnd w:id="3"/>
     </w:p>
     <w:p>
+      <w:pPr>
+        <w:ind w:left="360" w:hanging="360"/>
+      </w:pPr>
       <w:r>
         <w:rPr>
           <w:rFonts w:ascii="Ubuntu" w:hAnsi="Ubuntu"/>
@@ -5168,6 +5174,9 @@
       </w:r>
     </w:p>
     <w:p>
+      <w:pPr>
+        <w:ind w:left="360" w:hanging="360"/>
+      </w:pPr>
       <w:r>
         <w:rPr>
           <w:rFonts w:ascii="Ubuntu" w:hAnsi="Ubuntu"/>
@@ -5179,6 +5188,9 @@
       </w:r>
     </w:p>
     <w:p>
+      <w:pPr>
+        <w:ind w:left="360" w:hanging="360"/>
+      </w:pPr>
       <w:r>
         <w:rPr>
           <w:rFonts w:ascii="Ubuntu" w:hAnsi="Ubuntu"/>
@@ -5253,6 +5265,9 @@
       </w:r>
     </w:p>
     <w:p>
+      <w:pPr>
+        <w:ind w:left="360" w:hanging="360"/>
+      </w:pPr>
       <w:r>
         <w:rPr>
           <w:rFonts w:ascii="Ubuntu" w:hAnsi="Ubuntu"/>
@@ -5264,6 +5279,9 @@
       </w:r>
     </w:p>
     <w:p>
+      <w:pPr>
+        <w:ind w:left="360" w:hanging="360"/>
+      </w:pPr>
       <w:r>
         <w:rPr>
           <w:rFonts w:ascii="Ubuntu" w:hAnsi="Ubuntu"/>
@@ -5274,6 +5292,9 @@
       </w:r>
     </w:p>
     <w:p>
+      <w:pPr>
+        <w:ind w:left="360" w:hanging="360"/>
+      </w:pPr>
       <w:r>
         <w:rPr>
           <w:rFonts w:ascii="Ubuntu" w:hAnsi="Ubuntu"/>
@@ -5300,6 +5321,9 @@
       </w:r>
     </w:p>
     <w:p>
+      <w:pPr>
+        <w:ind w:left="360" w:hanging="360"/>
+      </w:pPr>
       <w:r>
         <w:rPr>
           <w:rFonts w:ascii="Ubuntu" w:hAnsi="Ubuntu"/>
@@ -5311,6 +5335,9 @@
       </w:r>
     </w:p>
     <w:p>
+      <w:pPr>
+        <w:ind w:left="360" w:hanging="360"/>
+      </w:pPr>
       <w:r>
         <w:rPr>
           <w:rFonts w:ascii="Ubuntu" w:hAnsi="Ubuntu"/>
@@ -5399,6 +5426,9 @@
       <w:bookmarkEnd w:id="4"/>
     </w:p>
     <w:p>
+      <w:pPr>
+        <w:ind w:left="360" w:hanging="360"/>
+      </w:pPr>
       <w:r>
         <w:rPr>
           <w:rFonts w:ascii="Ubuntu" w:hAnsi="Ubuntu"/>
@@ -5484,6 +5514,7 @@
     </w:p>
     <w:p>
       <w:pPr>
+        <w:ind w:left="360" w:hanging="360"/>
         <w:jc w:val="center"/>
       </w:pPr>
       <w:r>
@@ -5497,6 +5528,9 @@
       </w:r>
     </w:p>
     <w:p>
+      <w:pPr>
+        <w:ind w:left="360" w:hanging="360"/>
+      </w:pPr>
       <w:r>
         <w:rPr>
           <w:rFonts w:ascii="Ubuntu" w:hAnsi="Ubuntu"/>
@@ -5507,6 +5541,9 @@
       </w:r>
     </w:p>
     <w:p>
+      <w:pPr>
+        <w:ind w:left="360" w:hanging="360"/>
+      </w:pPr>
       <w:r>
         <w:rPr>
           <w:rFonts w:ascii="Ubuntu" w:hAnsi="Ubuntu"/>
@@ -5553,6 +5590,7 @@
     </w:p>
     <w:p>
       <w:pPr>
+        <w:ind w:left="360" w:hanging="360"/>
         <w:jc w:val="center"/>
       </w:pPr>
     </w:p>

</xml_diff>

<commit_message>
feat(odf): master pages give the document's pages, headers and footers
The first master page's page layout is the document's page (size, margins,
the body below its header and above its footer), and a paragraph whose
style names another master page starts a section of its pages. Each
section's master page's headers and footers are header and footer nodes of
their kind (default, even for a left page's, first), where only the first
master page's two were read, as loose paragraphs. Page number and count
fields are marked, and a presentation's slide size is its page.
</commit_message>
<xml_diff>
--- a/test/generator/baseline/gen.odp.to.docx.docx
+++ b/test/generator/baseline/gen.odp.to.docx.docx
@@ -705,8 +705,8 @@
         </w:tblBorders>
       </w:tblPr>
       <w:tblGrid>
-        <w:gridCol w:w="4513"/>
-        <w:gridCol w:w="4513"/>
+        <w:gridCol w:w="8160"/>
+        <w:gridCol w:w="8160"/>
       </w:tblGrid>
       <w:tr>
         <w:tc>
@@ -1001,12 +1001,12 @@
         </w:tblBorders>
       </w:tblPr>
       <w:tblGrid>
-        <w:gridCol w:w="1504"/>
-        <w:gridCol w:w="1504"/>
-        <w:gridCol w:w="1504"/>
-        <w:gridCol w:w="1504"/>
-        <w:gridCol w:w="1504"/>
-        <w:gridCol w:w="1504"/>
+        <w:gridCol w:w="2720"/>
+        <w:gridCol w:w="2720"/>
+        <w:gridCol w:w="2720"/>
+        <w:gridCol w:w="2720"/>
+        <w:gridCol w:w="2720"/>
+        <w:gridCol w:w="2720"/>
       </w:tblGrid>
       <w:tr>
         <w:tc>
@@ -1651,10 +1651,10 @@
         </w:tblBorders>
       </w:tblPr>
       <w:tblGrid>
-        <w:gridCol w:w="2256"/>
-        <w:gridCol w:w="2256"/>
-        <w:gridCol w:w="2256"/>
-        <w:gridCol w:w="2256"/>
+        <w:gridCol w:w="4080"/>
+        <w:gridCol w:w="4080"/>
+        <w:gridCol w:w="4080"/>
+        <w:gridCol w:w="4080"/>
       </w:tblGrid>
       <w:tr>
         <w:tc>
@@ -2318,8 +2318,8 @@
         </w:tblBorders>
       </w:tblPr>
       <w:tblGrid>
-        <w:gridCol w:w="4513"/>
-        <w:gridCol w:w="4513"/>
+        <w:gridCol w:w="8160"/>
+        <w:gridCol w:w="8160"/>
       </w:tblGrid>
       <w:tr>
         <w:tc>
@@ -2411,8 +2411,8 @@
         </w:tblBorders>
       </w:tblPr>
       <w:tblGrid>
-        <w:gridCol w:w="4513"/>
-        <w:gridCol w:w="4513"/>
+        <w:gridCol w:w="8160"/>
+        <w:gridCol w:w="8160"/>
       </w:tblGrid>
       <w:tr>
         <w:tc>
@@ -2498,20 +2498,20 @@
         </w:tblBorders>
       </w:tblPr>
       <w:tblGrid>
-        <w:gridCol w:w="644"/>
-        <w:gridCol w:w="644"/>
-        <w:gridCol w:w="644"/>
-        <w:gridCol w:w="644"/>
-        <w:gridCol w:w="644"/>
-        <w:gridCol w:w="644"/>
-        <w:gridCol w:w="644"/>
-        <w:gridCol w:w="644"/>
-        <w:gridCol w:w="644"/>
-        <w:gridCol w:w="644"/>
-        <w:gridCol w:w="644"/>
-        <w:gridCol w:w="644"/>
-        <w:gridCol w:w="644"/>
-        <w:gridCol w:w="644"/>
+        <w:gridCol w:w="1165"/>
+        <w:gridCol w:w="1165"/>
+        <w:gridCol w:w="1165"/>
+        <w:gridCol w:w="1165"/>
+        <w:gridCol w:w="1165"/>
+        <w:gridCol w:w="1165"/>
+        <w:gridCol w:w="1165"/>
+        <w:gridCol w:w="1165"/>
+        <w:gridCol w:w="1165"/>
+        <w:gridCol w:w="1165"/>
+        <w:gridCol w:w="1165"/>
+        <w:gridCol w:w="1165"/>
+        <w:gridCol w:w="1165"/>
+        <w:gridCol w:w="1165"/>
       </w:tblGrid>
       <w:tr>
         <w:tc>
@@ -5878,7 +5878,7 @@
       <w:r>
         <w:drawing>
           <wp:inline distT="0" distB="0" distL="0" distR="0">
-            <wp:extent cx="5731510" cy="5731510"/>
+            <wp:extent cx="10287000" cy="10287000"/>
             <wp:docPr id="1" name="image1" descr="165 Inspirational Quotes To Keep You Motivated In Life"/>
             <a:graphic xmlns:a="http://schemas.openxmlformats.org/drawingml/2006/main">
               <a:graphicData uri="http://schemas.openxmlformats.org/drawingml/2006/picture">
@@ -5896,7 +5896,7 @@
                   <pic:spPr>
                     <a:xfrm>
                       <a:off x="0" y="0"/>
-                      <a:ext cx="5731510" cy="5731510"/>
+                      <a:ext cx="10287000" cy="10287000"/>
                     </a:xfrm>
                     <a:prstGeom prst="rect">
                       <a:avLst/>
@@ -6438,10 +6438,10 @@
         </w:tblBorders>
       </w:tblPr>
       <w:tblGrid>
-        <w:gridCol w:w="2256"/>
-        <w:gridCol w:w="2256"/>
-        <w:gridCol w:w="2256"/>
-        <w:gridCol w:w="2256"/>
+        <w:gridCol w:w="4080"/>
+        <w:gridCol w:w="4080"/>
+        <w:gridCol w:w="4080"/>
+        <w:gridCol w:w="4080"/>
       </w:tblGrid>
       <w:tr>
         <w:tc>
@@ -6651,7 +6651,7 @@
       </w:tr>
     </w:tbl>
     <w:sectPr>
-      <w:pgSz w:w="11906" w:h="16838"/>
+      <w:pgSz w:w="19200" w:h="10800" w:orient="landscape"/>
       <w:pgMar w:top="1440" w:right="1440" w:bottom="1440" w:left="1440" w:header="708" w:footer="708" w:gutter="0"/>
     </w:sectPr>
   </w:body>

</xml_diff>

<commit_message>
feat(odp): slides' frames and shapes have their places and looks
An ODP slide's frames and shapes carry their box (svg:x, svg:y,
svg:width, svg:height, or a turned shape's draw:transform; a group's
shapes each their own), a filled, outlined or turned shape a drawing node
from its graphic style, and the slide its background (its drawing-page
style, else its master page's), as PPTX slides have them, so the native
PDF engine draws them as laid out. Writers write nothing for a drawing
node, and HTML output leaves no gap where one stands.
</commit_message>
<xml_diff>
--- a/test/generator/baseline/gen.odp.to.docx.docx
+++ b/test/generator/baseline/gen.odp.to.docx.docx
@@ -5878,7 +5878,7 @@
       <w:r>
         <w:drawing>
           <wp:inline distT="0" distB="0" distL="0" distR="0">
-            <wp:extent cx="10287000" cy="10287000"/>
+            <wp:extent cx="3574542" cy="3605530"/>
             <wp:docPr id="1" name="image1" descr="165 Inspirational Quotes To Keep You Motivated In Life"/>
             <a:graphic xmlns:a="http://schemas.openxmlformats.org/drawingml/2006/main">
               <a:graphicData uri="http://schemas.openxmlformats.org/drawingml/2006/picture">
@@ -5896,7 +5896,7 @@
                   <pic:spPr>
                     <a:xfrm>
                       <a:off x="0" y="0"/>
-                      <a:ext cx="10287000" cy="10287000"/>
+                      <a:ext cx="3574542" cy="3605530"/>
                     </a:xfrm>
                     <a:prstGeom prst="rect">
                       <a:avLst/>

</xml_diff>